<commit_message>
perfrom experiments with parser , starting of creation of intermediate state
</commit_message>
<xml_diff>
--- a/resource/documents/global_shipping_policy.docx
+++ b/resource/documents/global_shipping_policy.docx
@@ -24,7 +24,29 @@
           <w:sz w:val="48"/>
           <w:szCs w:val="48"/>
         </w:rPr>
-        <w:t>1. Global Shipping Policy</w:t>
+        <w:t xml:space="preserve">&lt;t&gt; </w:t>
+      </w:r>
+      <w:r>
+        <w:rPr>
+          <w:rFonts w:ascii="Times New Roman" w:eastAsia="Times New Roman" w:hAnsi="Times New Roman" w:cs="Times New Roman"/>
+          <w:b/>
+          <w:bCs/>
+          <w:kern w:val="36"/>
+          <w:sz w:val="48"/>
+          <w:szCs w:val="48"/>
+        </w:rPr>
+        <w:t>Global Shipping Policy</w:t>
+      </w:r>
+      <w:r>
+        <w:rPr>
+          <w:rFonts w:ascii="Times New Roman" w:eastAsia="Times New Roman" w:hAnsi="Times New Roman" w:cs="Times New Roman"/>
+          <w:b/>
+          <w:bCs/>
+          <w:kern w:val="36"/>
+          <w:sz w:val="48"/>
+          <w:szCs w:val="48"/>
+        </w:rPr>
+        <w:t xml:space="preserve"> &lt;/t&gt;</w:t>
       </w:r>
     </w:p>
     <w:p>
@@ -47,25 +69,101 @@
           <w:sz w:val="36"/>
           <w:szCs w:val="36"/>
         </w:rPr>
-        <w:t>Title</w:t>
-      </w:r>
-    </w:p>
-    <w:p>
-      <w:pPr>
-        <w:spacing w:before="100" w:beforeAutospacing="1" w:after="100" w:afterAutospacing="1" w:line="240" w:lineRule="auto"/>
-        <w:rPr>
-          <w:rFonts w:ascii="Times New Roman" w:eastAsia="Times New Roman" w:hAnsi="Times New Roman" w:cs="Times New Roman"/>
-          <w:sz w:val="24"/>
-          <w:szCs w:val="24"/>
-        </w:rPr>
-      </w:pPr>
-      <w:r>
-        <w:rPr>
-          <w:rFonts w:ascii="Times New Roman" w:eastAsia="Times New Roman" w:hAnsi="Times New Roman" w:cs="Times New Roman"/>
-          <w:sz w:val="24"/>
-          <w:szCs w:val="24"/>
-        </w:rPr>
-        <w:t>Global Shipping Policy</w:t>
+        <w:t>&lt;h</w:t>
+      </w:r>
+      <w:r>
+        <w:rPr>
+          <w:rFonts w:ascii="Times New Roman" w:eastAsia="Times New Roman" w:hAnsi="Times New Roman" w:cs="Times New Roman"/>
+          <w:b/>
+          <w:bCs/>
+          <w:sz w:val="36"/>
+          <w:szCs w:val="36"/>
+        </w:rPr>
+        <w:t>1</w:t>
+      </w:r>
+      <w:r>
+        <w:rPr>
+          <w:rFonts w:ascii="Times New Roman" w:eastAsia="Times New Roman" w:hAnsi="Times New Roman" w:cs="Times New Roman"/>
+          <w:b/>
+          <w:bCs/>
+          <w:sz w:val="36"/>
+          <w:szCs w:val="36"/>
+        </w:rPr>
+        <w:t>&gt;</w:t>
+      </w:r>
+      <w:r>
+        <w:rPr>
+          <w:rFonts w:ascii="Times New Roman" w:eastAsia="Times New Roman" w:hAnsi="Times New Roman" w:cs="Times New Roman"/>
+          <w:b/>
+          <w:bCs/>
+          <w:sz w:val="36"/>
+          <w:szCs w:val="36"/>
+        </w:rPr>
+        <w:t>Overview</w:t>
+      </w:r>
+      <w:r>
+        <w:rPr>
+          <w:rFonts w:ascii="Times New Roman" w:eastAsia="Times New Roman" w:hAnsi="Times New Roman" w:cs="Times New Roman"/>
+          <w:b/>
+          <w:bCs/>
+          <w:sz w:val="36"/>
+          <w:szCs w:val="36"/>
+        </w:rPr>
+        <w:t>&lt;/h</w:t>
+      </w:r>
+      <w:r>
+        <w:rPr>
+          <w:rFonts w:ascii="Times New Roman" w:eastAsia="Times New Roman" w:hAnsi="Times New Roman" w:cs="Times New Roman"/>
+          <w:b/>
+          <w:bCs/>
+          <w:sz w:val="36"/>
+          <w:szCs w:val="36"/>
+        </w:rPr>
+        <w:t>1</w:t>
+      </w:r>
+      <w:r>
+        <w:rPr>
+          <w:rFonts w:ascii="Times New Roman" w:eastAsia="Times New Roman" w:hAnsi="Times New Roman" w:cs="Times New Roman"/>
+          <w:b/>
+          <w:bCs/>
+          <w:sz w:val="36"/>
+          <w:szCs w:val="36"/>
+        </w:rPr>
+        <w:t>&gt;</w:t>
+      </w:r>
+    </w:p>
+    <w:p>
+      <w:pPr>
+        <w:spacing w:before="100" w:beforeAutospacing="1" w:after="100" w:afterAutospacing="1" w:line="240" w:lineRule="auto"/>
+        <w:rPr>
+          <w:rFonts w:ascii="Times New Roman" w:eastAsia="Times New Roman" w:hAnsi="Times New Roman" w:cs="Times New Roman"/>
+          <w:sz w:val="24"/>
+          <w:szCs w:val="24"/>
+        </w:rPr>
+      </w:pPr>
+      <w:r>
+        <w:rPr>
+          <w:rFonts w:ascii="Times New Roman" w:eastAsia="Times New Roman" w:hAnsi="Times New Roman" w:cs="Times New Roman"/>
+          <w:sz w:val="24"/>
+          <w:szCs w:val="24"/>
+        </w:rPr>
+        <w:t>&lt;p&gt;</w:t>
+      </w:r>
+      <w:r>
+        <w:rPr>
+          <w:rFonts w:ascii="Times New Roman" w:eastAsia="Times New Roman" w:hAnsi="Times New Roman" w:cs="Times New Roman"/>
+          <w:sz w:val="24"/>
+          <w:szCs w:val="24"/>
+        </w:rPr>
+        <w:t>This policy defines shipping timelines, shipping fees, international shipping eligibility, shipment tracking procedures, and lost shipment handling for all customer orders placed through ABC Ecommerce.</w:t>
+      </w:r>
+      <w:r>
+        <w:rPr>
+          <w:rFonts w:ascii="Times New Roman" w:eastAsia="Times New Roman" w:hAnsi="Times New Roman" w:cs="Times New Roman"/>
+          <w:sz w:val="24"/>
+          <w:szCs w:val="24"/>
+        </w:rPr>
+        <w:t>&lt;/p&gt;</w:t>
       </w:r>
     </w:p>
     <w:p>
@@ -88,39 +186,28 @@
           <w:sz w:val="36"/>
           <w:szCs w:val="36"/>
         </w:rPr>
-        <w:t>Overview</w:t>
-      </w:r>
-    </w:p>
-    <w:p>
-      <w:pPr>
-        <w:spacing w:before="100" w:beforeAutospacing="1" w:after="100" w:afterAutospacing="1" w:line="240" w:lineRule="auto"/>
-        <w:rPr>
-          <w:rFonts w:ascii="Times New Roman" w:eastAsia="Times New Roman" w:hAnsi="Times New Roman" w:cs="Times New Roman"/>
-          <w:sz w:val="24"/>
-          <w:szCs w:val="24"/>
-        </w:rPr>
-      </w:pPr>
-      <w:r>
-        <w:rPr>
-          <w:rFonts w:ascii="Times New Roman" w:eastAsia="Times New Roman" w:hAnsi="Times New Roman" w:cs="Times New Roman"/>
-          <w:sz w:val="24"/>
-          <w:szCs w:val="24"/>
-        </w:rPr>
-        <w:t>This policy defines shipping timelines, shipping fees, international shipping eligibility, shipment tracking procedures, and lost shipment handling for all customer orders placed through ABC Ecommerce.</w:t>
-      </w:r>
-    </w:p>
-    <w:p>
-      <w:pPr>
-        <w:spacing w:before="100" w:beforeAutospacing="1" w:after="100" w:afterAutospacing="1" w:line="240" w:lineRule="auto"/>
-        <w:outlineLvl w:val="1"/>
-        <w:rPr>
-          <w:rFonts w:ascii="Times New Roman" w:eastAsia="Times New Roman" w:hAnsi="Times New Roman" w:cs="Times New Roman"/>
-          <w:b/>
-          <w:bCs/>
-          <w:sz w:val="36"/>
-          <w:szCs w:val="36"/>
-        </w:rPr>
-      </w:pPr>
+        <w:t>&lt;h</w:t>
+      </w:r>
+      <w:r>
+        <w:rPr>
+          <w:rFonts w:ascii="Times New Roman" w:eastAsia="Times New Roman" w:hAnsi="Times New Roman" w:cs="Times New Roman"/>
+          <w:b/>
+          <w:bCs/>
+          <w:sz w:val="36"/>
+          <w:szCs w:val="36"/>
+        </w:rPr>
+        <w:t>1</w:t>
+      </w:r>
+      <w:r>
+        <w:rPr>
+          <w:rFonts w:ascii="Times New Roman" w:eastAsia="Times New Roman" w:hAnsi="Times New Roman" w:cs="Times New Roman"/>
+          <w:b/>
+          <w:bCs/>
+          <w:sz w:val="36"/>
+          <w:szCs w:val="36"/>
+        </w:rPr>
+        <w:t>&gt;</w:t>
+      </w:r>
       <w:r>
         <w:rPr>
           <w:rFonts w:ascii="Times New Roman" w:eastAsia="Times New Roman" w:hAnsi="Times New Roman" w:cs="Times New Roman"/>
@@ -130,6 +217,36 @@
           <w:szCs w:val="36"/>
         </w:rPr>
         <w:t>Eligibility</w:t>
+      </w:r>
+      <w:r>
+        <w:rPr>
+          <w:rFonts w:ascii="Times New Roman" w:eastAsia="Times New Roman" w:hAnsi="Times New Roman" w:cs="Times New Roman"/>
+          <w:b/>
+          <w:bCs/>
+          <w:sz w:val="36"/>
+          <w:szCs w:val="36"/>
+        </w:rPr>
+        <w:t>&lt;/h</w:t>
+      </w:r>
+      <w:r>
+        <w:rPr>
+          <w:rFonts w:ascii="Times New Roman" w:eastAsia="Times New Roman" w:hAnsi="Times New Roman" w:cs="Times New Roman"/>
+          <w:b/>
+          <w:bCs/>
+          <w:sz w:val="36"/>
+          <w:szCs w:val="36"/>
+        </w:rPr>
+        <w:t>1</w:t>
+      </w:r>
+      <w:r>
+        <w:rPr>
+          <w:rFonts w:ascii="Times New Roman" w:eastAsia="Times New Roman" w:hAnsi="Times New Roman" w:cs="Times New Roman"/>
+          <w:b/>
+          <w:bCs/>
+          <w:sz w:val="36"/>
+          <w:szCs w:val="36"/>
+        </w:rPr>
+        <w:t>&gt;</w:t>
       </w:r>
     </w:p>
     <w:p>
@@ -151,7 +268,7 @@
           <w:sz w:val="24"/>
           <w:szCs w:val="24"/>
         </w:rPr>
-        <w:t>Applies to all products sold on the platform.</w:t>
+        <w:t>&lt;list&gt;</w:t>
       </w:r>
     </w:p>
     <w:p>
@@ -173,7 +290,59 @@
           <w:sz w:val="24"/>
           <w:szCs w:val="24"/>
         </w:rPr>
-        <w:t>Shipping availability depends on customer location.</w:t>
+        <w:t>&lt;</w:t>
+      </w:r>
+      <w:proofErr w:type="spellStart"/>
+      <w:r>
+        <w:rPr>
+          <w:rFonts w:ascii="Times New Roman" w:eastAsia="Times New Roman" w:hAnsi="Times New Roman" w:cs="Times New Roman"/>
+          <w:sz w:val="24"/>
+          <w:szCs w:val="24"/>
+        </w:rPr>
+        <w:t>li</w:t>
+      </w:r>
+      <w:proofErr w:type="spellEnd"/>
+      <w:r>
+        <w:rPr>
+          <w:rFonts w:ascii="Times New Roman" w:eastAsia="Times New Roman" w:hAnsi="Times New Roman" w:cs="Times New Roman"/>
+          <w:sz w:val="24"/>
+          <w:szCs w:val="24"/>
+        </w:rPr>
+        <w:t>&gt;</w:t>
+      </w:r>
+      <w:r>
+        <w:rPr>
+          <w:rFonts w:ascii="Times New Roman" w:eastAsia="Times New Roman" w:hAnsi="Times New Roman" w:cs="Times New Roman"/>
+          <w:sz w:val="24"/>
+          <w:szCs w:val="24"/>
+        </w:rPr>
+        <w:t>Applies to all products sold on the platform.</w:t>
+      </w:r>
+      <w:r>
+        <w:rPr>
+          <w:rFonts w:ascii="Times New Roman" w:eastAsia="Times New Roman" w:hAnsi="Times New Roman" w:cs="Times New Roman"/>
+          <w:sz w:val="24"/>
+          <w:szCs w:val="24"/>
+        </w:rPr>
+        <w:t>&lt;/</w:t>
+      </w:r>
+      <w:proofErr w:type="spellStart"/>
+      <w:r>
+        <w:rPr>
+          <w:rFonts w:ascii="Times New Roman" w:eastAsia="Times New Roman" w:hAnsi="Times New Roman" w:cs="Times New Roman"/>
+          <w:sz w:val="24"/>
+          <w:szCs w:val="24"/>
+        </w:rPr>
+        <w:t>li</w:t>
+      </w:r>
+      <w:proofErr w:type="spellEnd"/>
+      <w:r>
+        <w:rPr>
+          <w:rFonts w:ascii="Times New Roman" w:eastAsia="Times New Roman" w:hAnsi="Times New Roman" w:cs="Times New Roman"/>
+          <w:sz w:val="24"/>
+          <w:szCs w:val="24"/>
+        </w:rPr>
+        <w:t>&gt;</w:t>
       </w:r>
     </w:p>
     <w:p>
@@ -195,7 +364,59 @@
           <w:sz w:val="24"/>
           <w:szCs w:val="24"/>
         </w:rPr>
-        <w:t>Certain regions may have restricted delivery.</w:t>
+        <w:t>&lt;</w:t>
+      </w:r>
+      <w:proofErr w:type="spellStart"/>
+      <w:r>
+        <w:rPr>
+          <w:rFonts w:ascii="Times New Roman" w:eastAsia="Times New Roman" w:hAnsi="Times New Roman" w:cs="Times New Roman"/>
+          <w:sz w:val="24"/>
+          <w:szCs w:val="24"/>
+        </w:rPr>
+        <w:t>li</w:t>
+      </w:r>
+      <w:proofErr w:type="spellEnd"/>
+      <w:r>
+        <w:rPr>
+          <w:rFonts w:ascii="Times New Roman" w:eastAsia="Times New Roman" w:hAnsi="Times New Roman" w:cs="Times New Roman"/>
+          <w:sz w:val="24"/>
+          <w:szCs w:val="24"/>
+        </w:rPr>
+        <w:t>&gt;</w:t>
+      </w:r>
+      <w:r>
+        <w:rPr>
+          <w:rFonts w:ascii="Times New Roman" w:eastAsia="Times New Roman" w:hAnsi="Times New Roman" w:cs="Times New Roman"/>
+          <w:sz w:val="24"/>
+          <w:szCs w:val="24"/>
+        </w:rPr>
+        <w:t>Shipping availability depends on customer location.</w:t>
+      </w:r>
+      <w:r>
+        <w:rPr>
+          <w:rFonts w:ascii="Times New Roman" w:eastAsia="Times New Roman" w:hAnsi="Times New Roman" w:cs="Times New Roman"/>
+          <w:sz w:val="24"/>
+          <w:szCs w:val="24"/>
+        </w:rPr>
+        <w:t>&lt;/</w:t>
+      </w:r>
+      <w:proofErr w:type="spellStart"/>
+      <w:r>
+        <w:rPr>
+          <w:rFonts w:ascii="Times New Roman" w:eastAsia="Times New Roman" w:hAnsi="Times New Roman" w:cs="Times New Roman"/>
+          <w:sz w:val="24"/>
+          <w:szCs w:val="24"/>
+        </w:rPr>
+        <w:t>li</w:t>
+      </w:r>
+      <w:proofErr w:type="spellEnd"/>
+      <w:r>
+        <w:rPr>
+          <w:rFonts w:ascii="Times New Roman" w:eastAsia="Times New Roman" w:hAnsi="Times New Roman" w:cs="Times New Roman"/>
+          <w:sz w:val="24"/>
+          <w:szCs w:val="24"/>
+        </w:rPr>
+        <w:t>&gt;</w:t>
       </w:r>
     </w:p>
     <w:p>
@@ -217,8 +438,156 @@
           <w:sz w:val="24"/>
           <w:szCs w:val="24"/>
         </w:rPr>
+        <w:t>&lt;</w:t>
+      </w:r>
+      <w:proofErr w:type="spellStart"/>
+      <w:r>
+        <w:rPr>
+          <w:rFonts w:ascii="Times New Roman" w:eastAsia="Times New Roman" w:hAnsi="Times New Roman" w:cs="Times New Roman"/>
+          <w:sz w:val="24"/>
+          <w:szCs w:val="24"/>
+        </w:rPr>
+        <w:t>li</w:t>
+      </w:r>
+      <w:proofErr w:type="spellEnd"/>
+      <w:r>
+        <w:rPr>
+          <w:rFonts w:ascii="Times New Roman" w:eastAsia="Times New Roman" w:hAnsi="Times New Roman" w:cs="Times New Roman"/>
+          <w:sz w:val="24"/>
+          <w:szCs w:val="24"/>
+        </w:rPr>
+        <w:t>&gt;</w:t>
+      </w:r>
+      <w:r>
+        <w:rPr>
+          <w:rFonts w:ascii="Times New Roman" w:eastAsia="Times New Roman" w:hAnsi="Times New Roman" w:cs="Times New Roman"/>
+          <w:sz w:val="24"/>
+          <w:szCs w:val="24"/>
+        </w:rPr>
+        <w:t>Certain regions may have restricted delivery.</w:t>
+      </w:r>
+      <w:r>
+        <w:rPr>
+          <w:rFonts w:ascii="Times New Roman" w:eastAsia="Times New Roman" w:hAnsi="Times New Roman" w:cs="Times New Roman"/>
+          <w:sz w:val="24"/>
+          <w:szCs w:val="24"/>
+        </w:rPr>
+        <w:t>&lt;/</w:t>
+      </w:r>
+      <w:proofErr w:type="spellStart"/>
+      <w:r>
+        <w:rPr>
+          <w:rFonts w:ascii="Times New Roman" w:eastAsia="Times New Roman" w:hAnsi="Times New Roman" w:cs="Times New Roman"/>
+          <w:sz w:val="24"/>
+          <w:szCs w:val="24"/>
+        </w:rPr>
+        <w:t>li</w:t>
+      </w:r>
+      <w:proofErr w:type="spellEnd"/>
+      <w:r>
+        <w:rPr>
+          <w:rFonts w:ascii="Times New Roman" w:eastAsia="Times New Roman" w:hAnsi="Times New Roman" w:cs="Times New Roman"/>
+          <w:sz w:val="24"/>
+          <w:szCs w:val="24"/>
+        </w:rPr>
+        <w:t>&gt;</w:t>
+      </w:r>
+    </w:p>
+    <w:p>
+      <w:pPr>
+        <w:numPr>
+          <w:ilvl w:val="0"/>
+          <w:numId w:val="1"/>
+        </w:numPr>
+        <w:spacing w:before="100" w:beforeAutospacing="1" w:after="100" w:afterAutospacing="1" w:line="240" w:lineRule="auto"/>
+        <w:rPr>
+          <w:rFonts w:ascii="Times New Roman" w:eastAsia="Times New Roman" w:hAnsi="Times New Roman" w:cs="Times New Roman"/>
+          <w:sz w:val="24"/>
+          <w:szCs w:val="24"/>
+        </w:rPr>
+      </w:pPr>
+      <w:r>
+        <w:rPr>
+          <w:rFonts w:ascii="Times New Roman" w:eastAsia="Times New Roman" w:hAnsi="Times New Roman" w:cs="Times New Roman"/>
+          <w:sz w:val="24"/>
+          <w:szCs w:val="24"/>
+        </w:rPr>
+        <w:t>&lt;</w:t>
+      </w:r>
+      <w:proofErr w:type="spellStart"/>
+      <w:r>
+        <w:rPr>
+          <w:rFonts w:ascii="Times New Roman" w:eastAsia="Times New Roman" w:hAnsi="Times New Roman" w:cs="Times New Roman"/>
+          <w:sz w:val="24"/>
+          <w:szCs w:val="24"/>
+        </w:rPr>
+        <w:t>li</w:t>
+      </w:r>
+      <w:proofErr w:type="spellEnd"/>
+      <w:r>
+        <w:rPr>
+          <w:rFonts w:ascii="Times New Roman" w:eastAsia="Times New Roman" w:hAnsi="Times New Roman" w:cs="Times New Roman"/>
+          <w:sz w:val="24"/>
+          <w:szCs w:val="24"/>
+        </w:rPr>
+        <w:t>&gt;</w:t>
+      </w:r>
+      <w:r>
+        <w:rPr>
+          <w:rFonts w:ascii="Times New Roman" w:eastAsia="Times New Roman" w:hAnsi="Times New Roman" w:cs="Times New Roman"/>
+          <w:sz w:val="24"/>
+          <w:szCs w:val="24"/>
+        </w:rPr>
         <w:t>International shipping availability varies by product category.</w:t>
       </w:r>
+      <w:r>
+        <w:rPr>
+          <w:rFonts w:ascii="Times New Roman" w:eastAsia="Times New Roman" w:hAnsi="Times New Roman" w:cs="Times New Roman"/>
+          <w:sz w:val="24"/>
+          <w:szCs w:val="24"/>
+        </w:rPr>
+        <w:t>&lt;/</w:t>
+      </w:r>
+      <w:proofErr w:type="spellStart"/>
+      <w:r>
+        <w:rPr>
+          <w:rFonts w:ascii="Times New Roman" w:eastAsia="Times New Roman" w:hAnsi="Times New Roman" w:cs="Times New Roman"/>
+          <w:sz w:val="24"/>
+          <w:szCs w:val="24"/>
+        </w:rPr>
+        <w:t>li</w:t>
+      </w:r>
+      <w:proofErr w:type="spellEnd"/>
+      <w:r>
+        <w:rPr>
+          <w:rFonts w:ascii="Times New Roman" w:eastAsia="Times New Roman" w:hAnsi="Times New Roman" w:cs="Times New Roman"/>
+          <w:sz w:val="24"/>
+          <w:szCs w:val="24"/>
+        </w:rPr>
+        <w:t>&gt;</w:t>
+      </w:r>
+    </w:p>
+    <w:p>
+      <w:pPr>
+        <w:numPr>
+          <w:ilvl w:val="0"/>
+          <w:numId w:val="1"/>
+        </w:numPr>
+        <w:spacing w:before="100" w:beforeAutospacing="1" w:after="100" w:afterAutospacing="1" w:line="240" w:lineRule="auto"/>
+        <w:rPr>
+          <w:rFonts w:ascii="Times New Roman" w:eastAsia="Times New Roman" w:hAnsi="Times New Roman" w:cs="Times New Roman"/>
+          <w:sz w:val="24"/>
+          <w:szCs w:val="24"/>
+        </w:rPr>
+      </w:pPr>
+      <w:r>
+        <w:rPr>
+          <w:rFonts w:ascii="Times New Roman" w:eastAsia="Times New Roman" w:hAnsi="Times New Roman" w:cs="Times New Roman"/>
+          <w:sz w:val="24"/>
+          <w:szCs w:val="24"/>
+        </w:rPr>
+        <w:t>&lt;/list&gt;</w:t>
+      </w:r>
     </w:p>
     <w:p>
       <w:pPr>
@@ -240,7 +609,27 @@
           <w:sz w:val="36"/>
           <w:szCs w:val="36"/>
         </w:rPr>
+        <w:t>&lt;h1&gt;</w:t>
+      </w:r>
+      <w:r>
+        <w:rPr>
+          <w:rFonts w:ascii="Times New Roman" w:eastAsia="Times New Roman" w:hAnsi="Times New Roman" w:cs="Times New Roman"/>
+          <w:b/>
+          <w:bCs/>
+          <w:sz w:val="36"/>
+          <w:szCs w:val="36"/>
+        </w:rPr>
         <w:t>Delivery Timelines</w:t>
+      </w:r>
+      <w:r>
+        <w:rPr>
+          <w:rFonts w:ascii="Times New Roman" w:eastAsia="Times New Roman" w:hAnsi="Times New Roman" w:cs="Times New Roman"/>
+          <w:b/>
+          <w:bCs/>
+          <w:sz w:val="36"/>
+          <w:szCs w:val="36"/>
+        </w:rPr>
+        <w:t>&lt;h1&gt;</w:t>
       </w:r>
     </w:p>
     <w:p>
@@ -263,7 +652,67 @@
           <w:sz w:val="27"/>
           <w:szCs w:val="27"/>
         </w:rPr>
+        <w:t>&lt;h</w:t>
+      </w:r>
+      <w:r>
+        <w:rPr>
+          <w:rFonts w:ascii="Times New Roman" w:eastAsia="Times New Roman" w:hAnsi="Times New Roman" w:cs="Times New Roman"/>
+          <w:b/>
+          <w:bCs/>
+          <w:sz w:val="27"/>
+          <w:szCs w:val="27"/>
+        </w:rPr>
+        <w:t>2</w:t>
+      </w:r>
+      <w:r>
+        <w:rPr>
+          <w:rFonts w:ascii="Times New Roman" w:eastAsia="Times New Roman" w:hAnsi="Times New Roman" w:cs="Times New Roman"/>
+          <w:b/>
+          <w:bCs/>
+          <w:sz w:val="27"/>
+          <w:szCs w:val="27"/>
+        </w:rPr>
+        <w:t>&gt;</w:t>
+      </w:r>
+      <w:r>
+        <w:rPr>
+          <w:rFonts w:ascii="Times New Roman" w:eastAsia="Times New Roman" w:hAnsi="Times New Roman" w:cs="Times New Roman"/>
+          <w:b/>
+          <w:bCs/>
+          <w:sz w:val="27"/>
+          <w:szCs w:val="27"/>
+        </w:rPr>
         <w:t>Domestic Shipping</w:t>
+      </w:r>
+      <w:r>
+        <w:rPr>
+          <w:rFonts w:ascii="Times New Roman" w:eastAsia="Times New Roman" w:hAnsi="Times New Roman" w:cs="Times New Roman"/>
+          <w:b/>
+          <w:bCs/>
+          <w:sz w:val="27"/>
+          <w:szCs w:val="27"/>
+        </w:rPr>
+        <w:t>&lt;/h</w:t>
+      </w:r>
+      <w:r>
+        <w:rPr>
+          <w:rFonts w:ascii="Times New Roman" w:eastAsia="Times New Roman" w:hAnsi="Times New Roman" w:cs="Times New Roman"/>
+          <w:b/>
+          <w:bCs/>
+          <w:sz w:val="27"/>
+          <w:szCs w:val="27"/>
+        </w:rPr>
+        <w:t>2</w:t>
+      </w:r>
+      <w:r>
+        <w:rPr>
+          <w:rFonts w:ascii="Times New Roman" w:eastAsia="Times New Roman" w:hAnsi="Times New Roman" w:cs="Times New Roman"/>
+          <w:b/>
+          <w:bCs/>
+          <w:sz w:val="27"/>
+          <w:szCs w:val="27"/>
+        </w:rPr>
+        <w:t>&gt;</w:t>
       </w:r>
     </w:p>
     <w:p>
@@ -285,7 +734,23 @@
           <w:sz w:val="24"/>
           <w:szCs w:val="24"/>
         </w:rPr>
-        <w:t>Standard Shipping: 3–7 business days</w:t>
+        <w:t>&lt;p&gt;</w:t>
+      </w:r>
+      <w:r>
+        <w:rPr>
+          <w:rFonts w:ascii="Times New Roman" w:eastAsia="Times New Roman" w:hAnsi="Times New Roman" w:cs="Times New Roman"/>
+          <w:sz w:val="24"/>
+          <w:szCs w:val="24"/>
+        </w:rPr>
+        <w:t>Standard Shipping: 3-</w:t>
+      </w:r>
+      <w:r>
+        <w:rPr>
+          <w:rFonts w:ascii="Times New Roman" w:eastAsia="Times New Roman" w:hAnsi="Times New Roman" w:cs="Times New Roman"/>
+          <w:sz w:val="24"/>
+          <w:szCs w:val="24"/>
+        </w:rPr>
+        <w:t>7 business days</w:t>
       </w:r>
     </w:p>
     <w:p>
@@ -307,7 +772,23 @@
           <w:sz w:val="24"/>
           <w:szCs w:val="24"/>
         </w:rPr>
-        <w:t>Express Shipping: 1–3 business days</w:t>
+        <w:t>Express Shipping: 1-</w:t>
+      </w:r>
+      <w:r>
+        <w:rPr>
+          <w:rFonts w:ascii="Times New Roman" w:eastAsia="Times New Roman" w:hAnsi="Times New Roman" w:cs="Times New Roman"/>
+          <w:sz w:val="24"/>
+          <w:szCs w:val="24"/>
+        </w:rPr>
+        <w:t>3 business days</w:t>
+      </w:r>
+      <w:r>
+        <w:rPr>
+          <w:rFonts w:ascii="Times New Roman" w:eastAsia="Times New Roman" w:hAnsi="Times New Roman" w:cs="Times New Roman"/>
+          <w:sz w:val="24"/>
+          <w:szCs w:val="24"/>
+        </w:rPr>
+        <w:t>&lt;/p&gt;</w:t>
       </w:r>
     </w:p>
     <w:p>
@@ -330,7 +811,67 @@
           <w:sz w:val="27"/>
           <w:szCs w:val="27"/>
         </w:rPr>
+        <w:t>&lt;h</w:t>
+      </w:r>
+      <w:r>
+        <w:rPr>
+          <w:rFonts w:ascii="Times New Roman" w:eastAsia="Times New Roman" w:hAnsi="Times New Roman" w:cs="Times New Roman"/>
+          <w:b/>
+          <w:bCs/>
+          <w:sz w:val="27"/>
+          <w:szCs w:val="27"/>
+        </w:rPr>
+        <w:t>2</w:t>
+      </w:r>
+      <w:r>
+        <w:rPr>
+          <w:rFonts w:ascii="Times New Roman" w:eastAsia="Times New Roman" w:hAnsi="Times New Roman" w:cs="Times New Roman"/>
+          <w:b/>
+          <w:bCs/>
+          <w:sz w:val="27"/>
+          <w:szCs w:val="27"/>
+        </w:rPr>
+        <w:t>&gt;</w:t>
+      </w:r>
+      <w:r>
+        <w:rPr>
+          <w:rFonts w:ascii="Times New Roman" w:eastAsia="Times New Roman" w:hAnsi="Times New Roman" w:cs="Times New Roman"/>
+          <w:b/>
+          <w:bCs/>
+          <w:sz w:val="27"/>
+          <w:szCs w:val="27"/>
+        </w:rPr>
         <w:t>International Shipping</w:t>
+      </w:r>
+      <w:r>
+        <w:rPr>
+          <w:rFonts w:ascii="Times New Roman" w:eastAsia="Times New Roman" w:hAnsi="Times New Roman" w:cs="Times New Roman"/>
+          <w:b/>
+          <w:bCs/>
+          <w:sz w:val="27"/>
+          <w:szCs w:val="27"/>
+        </w:rPr>
+        <w:t>&lt;/h</w:t>
+      </w:r>
+      <w:r>
+        <w:rPr>
+          <w:rFonts w:ascii="Times New Roman" w:eastAsia="Times New Roman" w:hAnsi="Times New Roman" w:cs="Times New Roman"/>
+          <w:b/>
+          <w:bCs/>
+          <w:sz w:val="27"/>
+          <w:szCs w:val="27"/>
+        </w:rPr>
+        <w:t>2</w:t>
+      </w:r>
+      <w:r>
+        <w:rPr>
+          <w:rFonts w:ascii="Times New Roman" w:eastAsia="Times New Roman" w:hAnsi="Times New Roman" w:cs="Times New Roman"/>
+          <w:b/>
+          <w:bCs/>
+          <w:sz w:val="27"/>
+          <w:szCs w:val="27"/>
+        </w:rPr>
+        <w:t>&gt;</w:t>
       </w:r>
     </w:p>
     <w:p>
@@ -352,7 +893,23 @@
           <w:sz w:val="24"/>
           <w:szCs w:val="24"/>
         </w:rPr>
-        <w:t>Standard International: 7–15 business days</w:t>
+        <w:t>&lt;p&gt;</w:t>
+      </w:r>
+      <w:r>
+        <w:rPr>
+          <w:rFonts w:ascii="Times New Roman" w:eastAsia="Times New Roman" w:hAnsi="Times New Roman" w:cs="Times New Roman"/>
+          <w:sz w:val="24"/>
+          <w:szCs w:val="24"/>
+        </w:rPr>
+        <w:t>Standard International: 7-</w:t>
+      </w:r>
+      <w:r>
+        <w:rPr>
+          <w:rFonts w:ascii="Times New Roman" w:eastAsia="Times New Roman" w:hAnsi="Times New Roman" w:cs="Times New Roman"/>
+          <w:sz w:val="24"/>
+          <w:szCs w:val="24"/>
+        </w:rPr>
+        <w:t>15 business days</w:t>
       </w:r>
     </w:p>
     <w:p>
@@ -374,7 +931,23 @@
           <w:sz w:val="24"/>
           <w:szCs w:val="24"/>
         </w:rPr>
-        <w:t>Priority International: 5–10 business days</w:t>
+        <w:t>Priority International: 5-</w:t>
+      </w:r>
+      <w:r>
+        <w:rPr>
+          <w:rFonts w:ascii="Times New Roman" w:eastAsia="Times New Roman" w:hAnsi="Times New Roman" w:cs="Times New Roman"/>
+          <w:sz w:val="24"/>
+          <w:szCs w:val="24"/>
+        </w:rPr>
+        <w:t>10 business days</w:t>
+      </w:r>
+      <w:r>
+        <w:rPr>
+          <w:rFonts w:ascii="Times New Roman" w:eastAsia="Times New Roman" w:hAnsi="Times New Roman" w:cs="Times New Roman"/>
+          <w:sz w:val="24"/>
+          <w:szCs w:val="24"/>
+        </w:rPr>
+        <w:t>&lt;/p&gt;</w:t>
       </w:r>
     </w:p>
     <w:p>
@@ -397,7 +970,67 @@
           <w:sz w:val="36"/>
           <w:szCs w:val="36"/>
         </w:rPr>
+        <w:t>&lt;h</w:t>
+      </w:r>
+      <w:r>
+        <w:rPr>
+          <w:rFonts w:ascii="Times New Roman" w:eastAsia="Times New Roman" w:hAnsi="Times New Roman" w:cs="Times New Roman"/>
+          <w:b/>
+          <w:bCs/>
+          <w:sz w:val="36"/>
+          <w:szCs w:val="36"/>
+        </w:rPr>
+        <w:t>1</w:t>
+      </w:r>
+      <w:r>
+        <w:rPr>
+          <w:rFonts w:ascii="Times New Roman" w:eastAsia="Times New Roman" w:hAnsi="Times New Roman" w:cs="Times New Roman"/>
+          <w:b/>
+          <w:bCs/>
+          <w:sz w:val="36"/>
+          <w:szCs w:val="36"/>
+        </w:rPr>
+        <w:t>&gt;</w:t>
+      </w:r>
+      <w:r>
+        <w:rPr>
+          <w:rFonts w:ascii="Times New Roman" w:eastAsia="Times New Roman" w:hAnsi="Times New Roman" w:cs="Times New Roman"/>
+          <w:b/>
+          <w:bCs/>
+          <w:sz w:val="36"/>
+          <w:szCs w:val="36"/>
+        </w:rPr>
         <w:t>Shipping Fees</w:t>
+      </w:r>
+      <w:r>
+        <w:rPr>
+          <w:rFonts w:ascii="Times New Roman" w:eastAsia="Times New Roman" w:hAnsi="Times New Roman" w:cs="Times New Roman"/>
+          <w:b/>
+          <w:bCs/>
+          <w:sz w:val="36"/>
+          <w:szCs w:val="36"/>
+        </w:rPr>
+        <w:t>&lt;/h</w:t>
+      </w:r>
+      <w:r>
+        <w:rPr>
+          <w:rFonts w:ascii="Times New Roman" w:eastAsia="Times New Roman" w:hAnsi="Times New Roman" w:cs="Times New Roman"/>
+          <w:b/>
+          <w:bCs/>
+          <w:sz w:val="36"/>
+          <w:szCs w:val="36"/>
+        </w:rPr>
+        <w:t>1</w:t>
+      </w:r>
+      <w:r>
+        <w:rPr>
+          <w:rFonts w:ascii="Times New Roman" w:eastAsia="Times New Roman" w:hAnsi="Times New Roman" w:cs="Times New Roman"/>
+          <w:b/>
+          <w:bCs/>
+          <w:sz w:val="36"/>
+          <w:szCs w:val="36"/>
+        </w:rPr>
+        <w:t>&gt;</w:t>
       </w:r>
     </w:p>
     <w:p>
@@ -419,7 +1052,49 @@
           <w:sz w:val="24"/>
           <w:szCs w:val="24"/>
         </w:rPr>
-        <w:t>Free shipping for orders above ₹5000.</w:t>
+        <w:t>&lt;p&gt;</w:t>
+      </w:r>
+      <w:r>
+        <w:rPr>
+          <w:rFonts w:ascii="Times New Roman" w:eastAsia="Times New Roman" w:hAnsi="Times New Roman" w:cs="Times New Roman"/>
+          <w:sz w:val="24"/>
+          <w:szCs w:val="24"/>
+        </w:rPr>
+        <w:t xml:space="preserve">Free shipping for orders above </w:t>
+      </w:r>
+      <w:r>
+        <w:rPr>
+          <w:rFonts w:ascii="Times New Roman" w:eastAsia="Times New Roman" w:hAnsi="Times New Roman" w:cs="Times New Roman"/>
+          <w:sz w:val="24"/>
+          <w:szCs w:val="24"/>
+        </w:rPr>
+        <w:t>5000</w:t>
+      </w:r>
+      <w:r>
+        <w:rPr>
+          <w:rFonts w:ascii="Times New Roman" w:eastAsia="Times New Roman" w:hAnsi="Times New Roman" w:cs="Times New Roman"/>
+          <w:sz w:val="24"/>
+          <w:szCs w:val="24"/>
+        </w:rPr>
+        <w:t xml:space="preserve"> </w:t>
+      </w:r>
+      <w:proofErr w:type="spellStart"/>
+      <w:r>
+        <w:rPr>
+          <w:rFonts w:ascii="Times New Roman" w:eastAsia="Times New Roman" w:hAnsi="Times New Roman" w:cs="Times New Roman"/>
+          <w:sz w:val="24"/>
+          <w:szCs w:val="24"/>
+        </w:rPr>
+        <w:t>rs</w:t>
+      </w:r>
+      <w:proofErr w:type="spellEnd"/>
+      <w:r>
+        <w:rPr>
+          <w:rFonts w:ascii="Times New Roman" w:eastAsia="Times New Roman" w:hAnsi="Times New Roman" w:cs="Times New Roman"/>
+          <w:sz w:val="24"/>
+          <w:szCs w:val="24"/>
+        </w:rPr>
+        <w:t>.</w:t>
       </w:r>
     </w:p>
     <w:p>
@@ -441,7 +1116,41 @@
           <w:sz w:val="24"/>
           <w:szCs w:val="24"/>
         </w:rPr>
-        <w:t>Standard shipping fee: ₹99.</w:t>
+        <w:t xml:space="preserve">Standard shipping fee: </w:t>
+      </w:r>
+      <w:r>
+        <w:rPr>
+          <w:rFonts w:ascii="Times New Roman" w:eastAsia="Times New Roman" w:hAnsi="Times New Roman" w:cs="Times New Roman"/>
+          <w:sz w:val="24"/>
+          <w:szCs w:val="24"/>
+        </w:rPr>
+        <w:t>99</w:t>
+      </w:r>
+      <w:r>
+        <w:rPr>
+          <w:rFonts w:ascii="Times New Roman" w:eastAsia="Times New Roman" w:hAnsi="Times New Roman" w:cs="Times New Roman"/>
+          <w:sz w:val="24"/>
+          <w:szCs w:val="24"/>
+        </w:rPr>
+        <w:t xml:space="preserve"> </w:t>
+      </w:r>
+      <w:proofErr w:type="spellStart"/>
+      <w:r>
+        <w:rPr>
+          <w:rFonts w:ascii="Times New Roman" w:eastAsia="Times New Roman" w:hAnsi="Times New Roman" w:cs="Times New Roman"/>
+          <w:sz w:val="24"/>
+          <w:szCs w:val="24"/>
+        </w:rPr>
+        <w:t>rs</w:t>
+      </w:r>
+      <w:proofErr w:type="spellEnd"/>
+      <w:r>
+        <w:rPr>
+          <w:rFonts w:ascii="Times New Roman" w:eastAsia="Times New Roman" w:hAnsi="Times New Roman" w:cs="Times New Roman"/>
+          <w:sz w:val="24"/>
+          <w:szCs w:val="24"/>
+        </w:rPr>
+        <w:t>.</w:t>
       </w:r>
     </w:p>
     <w:p>
@@ -463,7 +1172,41 @@
           <w:sz w:val="24"/>
           <w:szCs w:val="24"/>
         </w:rPr>
-        <w:t>Express shipping fee: ₹299.</w:t>
+        <w:t xml:space="preserve">Express shipping fee: </w:t>
+      </w:r>
+      <w:r>
+        <w:rPr>
+          <w:rFonts w:ascii="Times New Roman" w:eastAsia="Times New Roman" w:hAnsi="Times New Roman" w:cs="Times New Roman"/>
+          <w:sz w:val="24"/>
+          <w:szCs w:val="24"/>
+        </w:rPr>
+        <w:t>299</w:t>
+      </w:r>
+      <w:r>
+        <w:rPr>
+          <w:rFonts w:ascii="Times New Roman" w:eastAsia="Times New Roman" w:hAnsi="Times New Roman" w:cs="Times New Roman"/>
+          <w:sz w:val="24"/>
+          <w:szCs w:val="24"/>
+        </w:rPr>
+        <w:t xml:space="preserve"> </w:t>
+      </w:r>
+      <w:proofErr w:type="spellStart"/>
+      <w:r>
+        <w:rPr>
+          <w:rFonts w:ascii="Times New Roman" w:eastAsia="Times New Roman" w:hAnsi="Times New Roman" w:cs="Times New Roman"/>
+          <w:sz w:val="24"/>
+          <w:szCs w:val="24"/>
+        </w:rPr>
+        <w:t>rs</w:t>
+      </w:r>
+      <w:proofErr w:type="spellEnd"/>
+      <w:r>
+        <w:rPr>
+          <w:rFonts w:ascii="Times New Roman" w:eastAsia="Times New Roman" w:hAnsi="Times New Roman" w:cs="Times New Roman"/>
+          <w:sz w:val="24"/>
+          <w:szCs w:val="24"/>
+        </w:rPr>
+        <w:t>.</w:t>
       </w:r>
     </w:p>
     <w:p>
@@ -487,6 +1230,14 @@
         </w:rPr>
         <w:t>International shipping fees vary by destination.</w:t>
       </w:r>
+      <w:r>
+        <w:rPr>
+          <w:rFonts w:ascii="Times New Roman" w:eastAsia="Times New Roman" w:hAnsi="Times New Roman" w:cs="Times New Roman"/>
+          <w:sz w:val="24"/>
+          <w:szCs w:val="24"/>
+        </w:rPr>
+        <w:t>&lt;/p&gt;</w:t>
+      </w:r>
     </w:p>
     <w:p>
       <w:pPr>
@@ -508,7 +1259,67 @@
           <w:sz w:val="36"/>
           <w:szCs w:val="36"/>
         </w:rPr>
+        <w:t>&lt;h</w:t>
+      </w:r>
+      <w:r>
+        <w:rPr>
+          <w:rFonts w:ascii="Times New Roman" w:eastAsia="Times New Roman" w:hAnsi="Times New Roman" w:cs="Times New Roman"/>
+          <w:b/>
+          <w:bCs/>
+          <w:sz w:val="36"/>
+          <w:szCs w:val="36"/>
+        </w:rPr>
+        <w:t>1</w:t>
+      </w:r>
+      <w:r>
+        <w:rPr>
+          <w:rFonts w:ascii="Times New Roman" w:eastAsia="Times New Roman" w:hAnsi="Times New Roman" w:cs="Times New Roman"/>
+          <w:b/>
+          <w:bCs/>
+          <w:sz w:val="36"/>
+          <w:szCs w:val="36"/>
+        </w:rPr>
+        <w:t>&gt;</w:t>
+      </w:r>
+      <w:r>
+        <w:rPr>
+          <w:rFonts w:ascii="Times New Roman" w:eastAsia="Times New Roman" w:hAnsi="Times New Roman" w:cs="Times New Roman"/>
+          <w:b/>
+          <w:bCs/>
+          <w:sz w:val="36"/>
+          <w:szCs w:val="36"/>
+        </w:rPr>
         <w:t>Tracking Process</w:t>
+      </w:r>
+      <w:r>
+        <w:rPr>
+          <w:rFonts w:ascii="Times New Roman" w:eastAsia="Times New Roman" w:hAnsi="Times New Roman" w:cs="Times New Roman"/>
+          <w:b/>
+          <w:bCs/>
+          <w:sz w:val="36"/>
+          <w:szCs w:val="36"/>
+        </w:rPr>
+        <w:t>&lt;/h</w:t>
+      </w:r>
+      <w:r>
+        <w:rPr>
+          <w:rFonts w:ascii="Times New Roman" w:eastAsia="Times New Roman" w:hAnsi="Times New Roman" w:cs="Times New Roman"/>
+          <w:b/>
+          <w:bCs/>
+          <w:sz w:val="36"/>
+          <w:szCs w:val="36"/>
+        </w:rPr>
+        <w:t>1</w:t>
+      </w:r>
+      <w:r>
+        <w:rPr>
+          <w:rFonts w:ascii="Times New Roman" w:eastAsia="Times New Roman" w:hAnsi="Times New Roman" w:cs="Times New Roman"/>
+          <w:b/>
+          <w:bCs/>
+          <w:sz w:val="36"/>
+          <w:szCs w:val="36"/>
+        </w:rPr>
+        <w:t>&gt;</w:t>
       </w:r>
     </w:p>
     <w:p>
@@ -530,6 +1341,14 @@
           <w:sz w:val="24"/>
           <w:szCs w:val="24"/>
         </w:rPr>
+        <w:t>&lt;p&gt;</w:t>
+      </w:r>
+      <w:r>
+        <w:rPr>
+          <w:rFonts w:ascii="Times New Roman" w:eastAsia="Times New Roman" w:hAnsi="Times New Roman" w:cs="Times New Roman"/>
+          <w:sz w:val="24"/>
+          <w:szCs w:val="24"/>
+        </w:rPr>
         <w:t>Tracking details are shared through email and SMS.</w:t>
       </w:r>
     </w:p>
@@ -574,22 +1393,60 @@
           <w:sz w:val="24"/>
           <w:szCs w:val="24"/>
         </w:rPr>
+        <w:t>Tracking updates may take up to 24 hours after dispatch.</w:t>
+      </w:r>
+      <w:r>
+        <w:rPr>
+          <w:rFonts w:ascii="Times New Roman" w:eastAsia="Times New Roman" w:hAnsi="Times New Roman" w:cs="Times New Roman"/>
+          <w:sz w:val="24"/>
+          <w:szCs w:val="24"/>
+        </w:rPr>
+        <w:t>&lt;/p&gt;</w:t>
+      </w:r>
+    </w:p>
+    <w:p>
+      <w:pPr>
+        <w:spacing w:before="100" w:beforeAutospacing="1" w:after="100" w:afterAutospacing="1" w:line="240" w:lineRule="auto"/>
+        <w:outlineLvl w:val="1"/>
+        <w:rPr>
+          <w:rFonts w:ascii="Times New Roman" w:eastAsia="Times New Roman" w:hAnsi="Times New Roman" w:cs="Times New Roman"/>
+          <w:b/>
+          <w:bCs/>
+          <w:sz w:val="36"/>
+          <w:szCs w:val="36"/>
+        </w:rPr>
+      </w:pPr>
+      <w:r>
+        <w:rPr>
+          <w:rFonts w:ascii="Times New Roman" w:eastAsia="Times New Roman" w:hAnsi="Times New Roman" w:cs="Times New Roman"/>
+          <w:b/>
+          <w:bCs/>
+          <w:sz w:val="36"/>
+          <w:szCs w:val="36"/>
+        </w:rPr>
         <w:lastRenderedPageBreak/>
-        <w:t>Tracking updates may take up to 24 hours after dispatch.</w:t>
-      </w:r>
-    </w:p>
-    <w:p>
-      <w:pPr>
-        <w:spacing w:before="100" w:beforeAutospacing="1" w:after="100" w:afterAutospacing="1" w:line="240" w:lineRule="auto"/>
-        <w:outlineLvl w:val="1"/>
-        <w:rPr>
-          <w:rFonts w:ascii="Times New Roman" w:eastAsia="Times New Roman" w:hAnsi="Times New Roman" w:cs="Times New Roman"/>
-          <w:b/>
-          <w:bCs/>
-          <w:sz w:val="36"/>
-          <w:szCs w:val="36"/>
-        </w:rPr>
-      </w:pPr>
+        <w:t>&lt;h</w:t>
+      </w:r>
+      <w:r>
+        <w:rPr>
+          <w:rFonts w:ascii="Times New Roman" w:eastAsia="Times New Roman" w:hAnsi="Times New Roman" w:cs="Times New Roman"/>
+          <w:b/>
+          <w:bCs/>
+          <w:sz w:val="36"/>
+          <w:szCs w:val="36"/>
+        </w:rPr>
+        <w:t>1</w:t>
+      </w:r>
+      <w:r>
+        <w:rPr>
+          <w:rFonts w:ascii="Times New Roman" w:eastAsia="Times New Roman" w:hAnsi="Times New Roman" w:cs="Times New Roman"/>
+          <w:b/>
+          <w:bCs/>
+          <w:sz w:val="36"/>
+          <w:szCs w:val="36"/>
+        </w:rPr>
+        <w:t>&gt;</w:t>
+      </w:r>
       <w:r>
         <w:rPr>
           <w:rFonts w:ascii="Times New Roman" w:eastAsia="Times New Roman" w:hAnsi="Times New Roman" w:cs="Times New Roman"/>
@@ -599,6 +1456,36 @@
           <w:szCs w:val="36"/>
         </w:rPr>
         <w:t>Lost Shipments</w:t>
+      </w:r>
+      <w:r>
+        <w:rPr>
+          <w:rFonts w:ascii="Times New Roman" w:eastAsia="Times New Roman" w:hAnsi="Times New Roman" w:cs="Times New Roman"/>
+          <w:b/>
+          <w:bCs/>
+          <w:sz w:val="36"/>
+          <w:szCs w:val="36"/>
+        </w:rPr>
+        <w:t>&lt;/h</w:t>
+      </w:r>
+      <w:r>
+        <w:rPr>
+          <w:rFonts w:ascii="Times New Roman" w:eastAsia="Times New Roman" w:hAnsi="Times New Roman" w:cs="Times New Roman"/>
+          <w:b/>
+          <w:bCs/>
+          <w:sz w:val="36"/>
+          <w:szCs w:val="36"/>
+        </w:rPr>
+        <w:t>1</w:t>
+      </w:r>
+      <w:r>
+        <w:rPr>
+          <w:rFonts w:ascii="Times New Roman" w:eastAsia="Times New Roman" w:hAnsi="Times New Roman" w:cs="Times New Roman"/>
+          <w:b/>
+          <w:bCs/>
+          <w:sz w:val="36"/>
+          <w:szCs w:val="36"/>
+        </w:rPr>
+        <w:t>&gt;</w:t>
       </w:r>
     </w:p>
     <w:p>
@@ -620,6 +1507,14 @@
           <w:sz w:val="24"/>
           <w:szCs w:val="24"/>
         </w:rPr>
+        <w:t>&lt;p&gt;</w:t>
+      </w:r>
+      <w:r>
+        <w:rPr>
+          <w:rFonts w:ascii="Times New Roman" w:eastAsia="Times New Roman" w:hAnsi="Times New Roman" w:cs="Times New Roman"/>
+          <w:sz w:val="24"/>
+          <w:szCs w:val="24"/>
+        </w:rPr>
         <w:t>Orders marked lost after 10 business days beyond expected delivery date.</w:t>
       </w:r>
     </w:p>
@@ -664,7 +1559,15 @@
           <w:sz w:val="24"/>
           <w:szCs w:val="24"/>
         </w:rPr>
-        <w:t>Investigation timeline: 3–5 business days.</w:t>
+        <w:t>Investigation timeline: 3-</w:t>
+      </w:r>
+      <w:r>
+        <w:rPr>
+          <w:rFonts w:ascii="Times New Roman" w:eastAsia="Times New Roman" w:hAnsi="Times New Roman" w:cs="Times New Roman"/>
+          <w:sz w:val="24"/>
+          <w:szCs w:val="24"/>
+        </w:rPr>
+        <w:t>5 business days.</w:t>
       </w:r>
     </w:p>
     <w:p>
@@ -688,6 +1591,14 @@
         </w:rPr>
         <w:t>Eligible customers may receive replacement or refund.</w:t>
       </w:r>
+      <w:r>
+        <w:rPr>
+          <w:rFonts w:ascii="Times New Roman" w:eastAsia="Times New Roman" w:hAnsi="Times New Roman" w:cs="Times New Roman"/>
+          <w:sz w:val="24"/>
+          <w:szCs w:val="24"/>
+        </w:rPr>
+        <w:t>&lt;/p&gt;</w:t>
+      </w:r>
     </w:p>
     <w:p>
       <w:pPr>
@@ -709,7 +1620,67 @@
           <w:sz w:val="36"/>
           <w:szCs w:val="36"/>
         </w:rPr>
+        <w:t>&lt;h</w:t>
+      </w:r>
+      <w:r>
+        <w:rPr>
+          <w:rFonts w:ascii="Times New Roman" w:eastAsia="Times New Roman" w:hAnsi="Times New Roman" w:cs="Times New Roman"/>
+          <w:b/>
+          <w:bCs/>
+          <w:sz w:val="36"/>
+          <w:szCs w:val="36"/>
+        </w:rPr>
+        <w:t>1</w:t>
+      </w:r>
+      <w:r>
+        <w:rPr>
+          <w:rFonts w:ascii="Times New Roman" w:eastAsia="Times New Roman" w:hAnsi="Times New Roman" w:cs="Times New Roman"/>
+          <w:b/>
+          <w:bCs/>
+          <w:sz w:val="36"/>
+          <w:szCs w:val="36"/>
+        </w:rPr>
+        <w:t>&gt;</w:t>
+      </w:r>
+      <w:r>
+        <w:rPr>
+          <w:rFonts w:ascii="Times New Roman" w:eastAsia="Times New Roman" w:hAnsi="Times New Roman" w:cs="Times New Roman"/>
+          <w:b/>
+          <w:bCs/>
+          <w:sz w:val="36"/>
+          <w:szCs w:val="36"/>
+        </w:rPr>
         <w:t>Exceptions</w:t>
+      </w:r>
+      <w:r>
+        <w:rPr>
+          <w:rFonts w:ascii="Times New Roman" w:eastAsia="Times New Roman" w:hAnsi="Times New Roman" w:cs="Times New Roman"/>
+          <w:b/>
+          <w:bCs/>
+          <w:sz w:val="36"/>
+          <w:szCs w:val="36"/>
+        </w:rPr>
+        <w:t>&lt;/h</w:t>
+      </w:r>
+      <w:r>
+        <w:rPr>
+          <w:rFonts w:ascii="Times New Roman" w:eastAsia="Times New Roman" w:hAnsi="Times New Roman" w:cs="Times New Roman"/>
+          <w:b/>
+          <w:bCs/>
+          <w:sz w:val="36"/>
+          <w:szCs w:val="36"/>
+        </w:rPr>
+        <w:t>1</w:t>
+      </w:r>
+      <w:r>
+        <w:rPr>
+          <w:rFonts w:ascii="Times New Roman" w:eastAsia="Times New Roman" w:hAnsi="Times New Roman" w:cs="Times New Roman"/>
+          <w:b/>
+          <w:bCs/>
+          <w:sz w:val="36"/>
+          <w:szCs w:val="36"/>
+        </w:rPr>
+        <w:t>&gt;</w:t>
       </w:r>
     </w:p>
     <w:p>
@@ -731,6 +1702,14 @@
           <w:sz w:val="24"/>
           <w:szCs w:val="24"/>
         </w:rPr>
+        <w:t>&lt;p&gt;</w:t>
+      </w:r>
+      <w:r>
+        <w:rPr>
+          <w:rFonts w:ascii="Times New Roman" w:eastAsia="Times New Roman" w:hAnsi="Times New Roman" w:cs="Times New Roman"/>
+          <w:sz w:val="24"/>
+          <w:szCs w:val="24"/>
+        </w:rPr>
         <w:t>Weather conditions may delay shipments.</w:t>
       </w:r>
     </w:p>
@@ -777,6 +1756,14 @@
         </w:rPr>
         <w:t>High-demand product launches may increase delivery timelines.</w:t>
       </w:r>
+      <w:r>
+        <w:rPr>
+          <w:rFonts w:ascii="Times New Roman" w:eastAsia="Times New Roman" w:hAnsi="Times New Roman" w:cs="Times New Roman"/>
+          <w:sz w:val="24"/>
+          <w:szCs w:val="24"/>
+        </w:rPr>
+        <w:t>&lt;/p&gt;</w:t>
+      </w:r>
     </w:p>
     <w:p>
       <w:pPr>
@@ -814,6 +1801,17 @@
         </w:rPr>
       </w:pPr>
       <w:r>
+        <w:t>&lt;</w:t>
+      </w:r>
+      <w:proofErr w:type="spellStart"/>
+      <w:r>
+        <w:t>faq</w:t>
+      </w:r>
+      <w:proofErr w:type="spellEnd"/>
+      <w:r>
+        <w:t>-q&gt;</w:t>
+      </w:r>
+      <w:r>
         <w:rPr>
           <w:rFonts w:ascii="Times New Roman" w:eastAsia="Times New Roman" w:hAnsi="Times New Roman" w:cs="Times New Roman"/>
           <w:b/>
@@ -845,16 +1843,46 @@
         </w:rPr>
         <w:t xml:space="preserve"> changed after dispatch?</w:t>
       </w:r>
-    </w:p>
-    <w:p>
-      <w:pPr>
-        <w:spacing w:before="100" w:beforeAutospacing="1" w:after="100" w:afterAutospacing="1" w:line="240" w:lineRule="auto"/>
-        <w:rPr>
-          <w:rFonts w:ascii="Times New Roman" w:eastAsia="Times New Roman" w:hAnsi="Times New Roman" w:cs="Times New Roman"/>
-          <w:sz w:val="24"/>
-          <w:szCs w:val="24"/>
-        </w:rPr>
-      </w:pPr>
+      <w:r>
+        <w:t xml:space="preserve"> </w:t>
+      </w:r>
+      <w:r>
+        <w:t>&lt;/</w:t>
+      </w:r>
+      <w:proofErr w:type="spellStart"/>
+      <w:r>
+        <w:t>faq</w:t>
+      </w:r>
+      <w:proofErr w:type="spellEnd"/>
+      <w:r>
+        <w:t>-q&gt;</w:t>
+      </w:r>
+    </w:p>
+    <w:p>
+      <w:pPr>
+        <w:spacing w:before="100" w:beforeAutospacing="1" w:after="100" w:afterAutospacing="1" w:line="240" w:lineRule="auto"/>
+        <w:rPr>
+          <w:rFonts w:ascii="Times New Roman" w:eastAsia="Times New Roman" w:hAnsi="Times New Roman" w:cs="Times New Roman"/>
+          <w:sz w:val="24"/>
+          <w:szCs w:val="24"/>
+        </w:rPr>
+      </w:pPr>
+      <w:r>
+        <w:t>&lt;</w:t>
+      </w:r>
+      <w:proofErr w:type="spellStart"/>
+      <w:proofErr w:type="gramStart"/>
+      <w:r>
+        <w:t>faq</w:t>
+      </w:r>
+      <w:proofErr w:type="spellEnd"/>
+      <w:r>
+        <w:t>-</w:t>
+      </w:r>
+      <w:proofErr w:type="gramEnd"/>
+      <w:r>
+        <w:t>a&gt;</w:t>
+      </w:r>
       <w:r>
         <w:rPr>
           <w:rFonts w:ascii="Times New Roman" w:eastAsia="Times New Roman" w:hAnsi="Times New Roman" w:cs="Times New Roman"/>
@@ -862,6 +1890,25 @@
           <w:szCs w:val="24"/>
         </w:rPr>
         <w:t>No. Address changes are not allowed after dispatch.</w:t>
+      </w:r>
+      <w:r>
+        <w:t xml:space="preserve"> </w:t>
+      </w:r>
+      <w:r>
+        <w:t>&lt;/</w:t>
+      </w:r>
+      <w:proofErr w:type="spellStart"/>
+      <w:proofErr w:type="gramStart"/>
+      <w:r>
+        <w:t>faq</w:t>
+      </w:r>
+      <w:proofErr w:type="spellEnd"/>
+      <w:r>
+        <w:t>-</w:t>
+      </w:r>
+      <w:proofErr w:type="gramEnd"/>
+      <w:r>
+        <w:t>a&gt;</w:t>
       </w:r>
     </w:p>
     <w:p>
@@ -877,6 +1924,17 @@
         </w:rPr>
       </w:pPr>
       <w:r>
+        <w:t>&lt;</w:t>
+      </w:r>
+      <w:proofErr w:type="spellStart"/>
+      <w:r>
+        <w:t>faq</w:t>
+      </w:r>
+      <w:proofErr w:type="spellEnd"/>
+      <w:r>
+        <w:t>-q&gt;</w:t>
+      </w:r>
+      <w:r>
         <w:rPr>
           <w:rFonts w:ascii="Times New Roman" w:eastAsia="Times New Roman" w:hAnsi="Times New Roman" w:cs="Times New Roman"/>
           <w:b/>
@@ -886,16 +1944,46 @@
         </w:rPr>
         <w:t>Q: Are customs charges included?</w:t>
       </w:r>
-    </w:p>
-    <w:p>
-      <w:pPr>
-        <w:spacing w:before="100" w:beforeAutospacing="1" w:after="100" w:afterAutospacing="1" w:line="240" w:lineRule="auto"/>
-        <w:rPr>
-          <w:rFonts w:ascii="Times New Roman" w:eastAsia="Times New Roman" w:hAnsi="Times New Roman" w:cs="Times New Roman"/>
-          <w:sz w:val="24"/>
-          <w:szCs w:val="24"/>
-        </w:rPr>
-      </w:pPr>
+      <w:r>
+        <w:t xml:space="preserve"> </w:t>
+      </w:r>
+      <w:r>
+        <w:t>&lt;/</w:t>
+      </w:r>
+      <w:proofErr w:type="spellStart"/>
+      <w:r>
+        <w:t>faq</w:t>
+      </w:r>
+      <w:proofErr w:type="spellEnd"/>
+      <w:r>
+        <w:t>-q&gt;</w:t>
+      </w:r>
+    </w:p>
+    <w:p>
+      <w:pPr>
+        <w:spacing w:before="100" w:beforeAutospacing="1" w:after="100" w:afterAutospacing="1" w:line="240" w:lineRule="auto"/>
+        <w:rPr>
+          <w:rFonts w:ascii="Times New Roman" w:eastAsia="Times New Roman" w:hAnsi="Times New Roman" w:cs="Times New Roman"/>
+          <w:sz w:val="24"/>
+          <w:szCs w:val="24"/>
+        </w:rPr>
+      </w:pPr>
+      <w:r>
+        <w:t>&lt;</w:t>
+      </w:r>
+      <w:proofErr w:type="spellStart"/>
+      <w:proofErr w:type="gramStart"/>
+      <w:r>
+        <w:t>faq</w:t>
+      </w:r>
+      <w:proofErr w:type="spellEnd"/>
+      <w:r>
+        <w:t>-</w:t>
+      </w:r>
+      <w:proofErr w:type="gramEnd"/>
+      <w:r>
+        <w:t>a&gt;</w:t>
+      </w:r>
       <w:r>
         <w:rPr>
           <w:rFonts w:ascii="Times New Roman" w:eastAsia="Times New Roman" w:hAnsi="Times New Roman" w:cs="Times New Roman"/>
@@ -903,6 +1991,25 @@
           <w:szCs w:val="24"/>
         </w:rPr>
         <w:t>No. International customers are responsible for customs duties.</w:t>
+      </w:r>
+      <w:r>
+        <w:t xml:space="preserve"> </w:t>
+      </w:r>
+      <w:r>
+        <w:t>&lt;/</w:t>
+      </w:r>
+      <w:proofErr w:type="spellStart"/>
+      <w:proofErr w:type="gramStart"/>
+      <w:r>
+        <w:t>faq</w:t>
+      </w:r>
+      <w:proofErr w:type="spellEnd"/>
+      <w:r>
+        <w:t>-</w:t>
+      </w:r>
+      <w:proofErr w:type="gramEnd"/>
+      <w:r>
+        <w:t>a&gt;</w:t>
       </w:r>
     </w:p>
     <w:p/>
@@ -2144,6 +3251,7 @@
   <w:style w:type="paragraph" w:default="1" w:styleId="Normal">
     <w:name w:val="Normal"/>
     <w:qFormat/>
+    <w:rsid w:val="00064DF8"/>
   </w:style>
   <w:style w:type="character" w:default="1" w:styleId="DefaultParagraphFont">
     <w:name w:val="Default Paragraph Font"/>

</xml_diff>

<commit_message>
work on semantics chunkings part-1
</commit_message>
<xml_diff>
--- a/resource/documents/global_shipping_policy.docx
+++ b/resource/documents/global_shipping_policy.docx
@@ -1785,7 +1785,27 @@
           <w:sz w:val="36"/>
           <w:szCs w:val="36"/>
         </w:rPr>
+        <w:t>&lt;h1&gt;</w:t>
+      </w:r>
+      <w:r>
+        <w:rPr>
+          <w:rFonts w:ascii="Times New Roman" w:eastAsia="Times New Roman" w:hAnsi="Times New Roman" w:cs="Times New Roman"/>
+          <w:b/>
+          <w:bCs/>
+          <w:sz w:val="36"/>
+          <w:szCs w:val="36"/>
+        </w:rPr>
         <w:t>FAQs</w:t>
+      </w:r>
+      <w:r>
+        <w:rPr>
+          <w:rFonts w:ascii="Times New Roman" w:eastAsia="Times New Roman" w:hAnsi="Times New Roman" w:cs="Times New Roman"/>
+          <w:b/>
+          <w:bCs/>
+          <w:sz w:val="36"/>
+          <w:szCs w:val="36"/>
+        </w:rPr>
+        <w:t>&lt;/h1&gt;</w:t>
       </w:r>
     </w:p>
     <w:p>

</xml_diff>